<commit_message>
Full rebuild - Shmini Atzeres (2) 5786
</commit_message>
<xml_diff>
--- a/Files/06 - Yom Tov/13 - Shmini Atzeres/5786/Shmini Atzeres (2)/Shmini Atzeres (2) 5786.docx
+++ b/Files/06 - Yom Tov/13 - Shmini Atzeres/5786/Shmini Atzeres (2)/Shmini Atzeres (2) 5786.docx
@@ -968,7 +968,7 @@
         <w:rPr>
           <w:rFonts w:ascii="Times New Roman" w:hAnsi="Times New Roman" w:cs="Times New Roman"/>
         </w:rPr>
-        <w:t>. That is what</w:t>
+        <w:t xml:space="preserve">. That is what </w:t>
       </w:r>
       <w:r>
         <w:rPr>
@@ -1073,7 +1073,7 @@
         <w:rPr>
           <w:rFonts w:ascii="Times New Roman" w:hAnsi="Times New Roman" w:cs="Times New Roman"/>
         </w:rPr>
-        <w:t xml:space="preserve"> of</w:t>
+        <w:t xml:space="preserve"> of </w:t>
       </w:r>
       <w:r>
         <w:rPr>

</xml_diff>